<commit_message>
add: investigacion de usuarios en la documentacion
</commit_message>
<xml_diff>
--- a/Documentation/Friendnote planning and documentation.docx
+++ b/Documentation/Friendnote planning and documentation.docx
@@ -7,11 +7,9 @@
         <w:pStyle w:val="Ttulo1"/>
         <w:jc w:val="center"/>
       </w:pPr>
-      <w:proofErr w:type="spellStart"/>
       <w:r>
         <w:t>FriendNote</w:t>
       </w:r>
-      <w:proofErr w:type="spellEnd"/>
     </w:p>
     <w:p/>
     <w:p/>
@@ -35,16 +33,8 @@
         <w:rPr>
           <w:rFonts w:ascii="Times New Roman" w:hAnsi="Times New Roman" w:cs="Times New Roman"/>
         </w:rPr>
-        <w:t xml:space="preserve">Andres Felipe Rojas </w:t>
-      </w:r>
-      <w:proofErr w:type="spellStart"/>
-      <w:r>
-        <w:rPr>
-          <w:rFonts w:ascii="Times New Roman" w:hAnsi="Times New Roman" w:cs="Times New Roman"/>
-        </w:rPr>
-        <w:t>Sanchez</w:t>
-      </w:r>
-      <w:proofErr w:type="spellEnd"/>
+        <w:t>Andres Felipe Rojas Sanchez</w:t>
+      </w:r>
     </w:p>
     <w:p>
       <w:pPr>
@@ -143,16 +133,8 @@
         <w:rPr>
           <w:rFonts w:ascii="Times New Roman" w:hAnsi="Times New Roman" w:cs="Times New Roman"/>
         </w:rPr>
-        <w:t xml:space="preserve">Sede </w:t>
-      </w:r>
-      <w:proofErr w:type="spellStart"/>
-      <w:r>
-        <w:rPr>
-          <w:rFonts w:ascii="Times New Roman" w:hAnsi="Times New Roman" w:cs="Times New Roman"/>
-        </w:rPr>
-        <w:t>Tulua</w:t>
-      </w:r>
-      <w:proofErr w:type="spellEnd"/>
+        <w:t>Sede Tulua</w:t>
+      </w:r>
     </w:p>
     <w:p>
       <w:pPr>
@@ -214,15 +196,7 @@
     <w:p/>
     <w:p>
       <w:r>
-        <w:t xml:space="preserve">Con esta problemática en mente, el desarrollo de </w:t>
-      </w:r>
-      <w:proofErr w:type="spellStart"/>
-      <w:r>
-        <w:t>Friendnote</w:t>
-      </w:r>
-      <w:proofErr w:type="spellEnd"/>
-      <w:r>
-        <w:t xml:space="preserve"> atiende a la necesidad de apuntes accesibles, fáciles y sin barreras abusivas para su encuentro. Permitiendo a los usuarios subir sus notas y/o apuntes en la aplicación, y en base a su utilidad y/o los usuarios que las encuentren y usen recibir recompensas, a la vez que el estudiante en necesidad de estos apuntes tiene un acceso libre y una base de datos abierta para ayudarse en las temáticas filtradas por institución, materia e incluso docente.</w:t>
+        <w:t>Con esta problemática en mente, el desarrollo de Friendnote atiende a la necesidad de apuntes accesibles, fáciles y sin barreras abusivas para su encuentro. Permitiendo a los usuarios subir sus notas y/o apuntes en la aplicación, y en base a su utilidad y/o los usuarios que las encuentren y usen recibir recompensas, a la vez que el estudiante en necesidad de estos apuntes tiene un acceso libre y una base de datos abierta para ayudarse en las temáticas filtradas por institución, materia e incluso docente.</w:t>
       </w:r>
     </w:p>
     <w:p/>
@@ -240,15 +214,7 @@
     </w:p>
     <w:p>
       <w:r>
-        <w:t xml:space="preserve">Los usuarios a los que </w:t>
-      </w:r>
-      <w:proofErr w:type="spellStart"/>
-      <w:r>
-        <w:t>FriendNote</w:t>
-      </w:r>
-      <w:proofErr w:type="spellEnd"/>
-      <w:r>
-        <w:t xml:space="preserve"> apunta son principalmente estudiantes a partir de sexto grado(bachillerato) que empiezan ya a necesitar una metodología mas ordenada de estudio hasta estudiantes universitarios tanto de pregrado, especialización o maestría que ya están enfrentando las etapas mas duras de aprendizaje donde la sensación de comunidad y compañerismo puede</w:t>
+        <w:t>Los usuarios a los que FriendNote apunta son principalmente estudiantes a partir de sexto grado(bachillerato) que empiezan ya a necesitar una metodología mas ordenada de estudio hasta estudiantes universitarios tanto de pregrado, especialización o maestría que ya están enfrentando las etapas mas duras de aprendizaje donde la sensación de comunidad y compañerismo puede</w:t>
       </w:r>
       <w:r>
         <w:t>n ser claves en el desarrollo de la titulación.</w:t>
@@ -272,7 +238,85 @@
         <w:t>Investigación de usuarios</w:t>
       </w:r>
     </w:p>
-    <w:p>
+    <w:p/>
+    <w:p>
+      <w:r>
+        <w:drawing>
+          <wp:inline distT="0" distB="0" distL="0" distR="0" wp14:anchorId="3C9D216F" wp14:editId="3E64EFC6">
+            <wp:extent cx="5612130" cy="2729865"/>
+            <wp:effectExtent l="0" t="0" r="7620" b="0"/>
+            <wp:docPr id="477469569" name="Imagen 1"/>
+            <wp:cNvGraphicFramePr>
+              <a:graphicFrameLocks xmlns:a="http://schemas.openxmlformats.org/drawingml/2006/main" noChangeAspect="1"/>
+            </wp:cNvGraphicFramePr>
+            <a:graphic xmlns:a="http://schemas.openxmlformats.org/drawingml/2006/main">
+              <a:graphicData uri="http://schemas.openxmlformats.org/drawingml/2006/picture">
+                <pic:pic xmlns:pic="http://schemas.openxmlformats.org/drawingml/2006/picture">
+                  <pic:nvPicPr>
+                    <pic:cNvPr id="477469569" name=""/>
+                    <pic:cNvPicPr/>
+                  </pic:nvPicPr>
+                  <pic:blipFill>
+                    <a:blip r:embed="rId7"/>
+                    <a:stretch>
+                      <a:fillRect/>
+                    </a:stretch>
+                  </pic:blipFill>
+                  <pic:spPr>
+                    <a:xfrm>
+                      <a:off x="0" y="0"/>
+                      <a:ext cx="5612130" cy="2729865"/>
+                    </a:xfrm>
+                    <a:prstGeom prst="rect">
+                      <a:avLst/>
+                    </a:prstGeom>
+                  </pic:spPr>
+                </pic:pic>
+              </a:graphicData>
+            </a:graphic>
+          </wp:inline>
+        </w:drawing>
+      </w:r>
+    </w:p>
+    <w:p/>
+    <w:p>
+      <w:r>
+        <w:drawing>
+          <wp:inline distT="0" distB="0" distL="0" distR="0" wp14:anchorId="5A2125E5" wp14:editId="64E51EF6">
+            <wp:extent cx="5612130" cy="2694305"/>
+            <wp:effectExtent l="0" t="0" r="7620" b="0"/>
+            <wp:docPr id="577121289" name="Imagen 1"/>
+            <wp:cNvGraphicFramePr>
+              <a:graphicFrameLocks xmlns:a="http://schemas.openxmlformats.org/drawingml/2006/main" noChangeAspect="1"/>
+            </wp:cNvGraphicFramePr>
+            <a:graphic xmlns:a="http://schemas.openxmlformats.org/drawingml/2006/main">
+              <a:graphicData uri="http://schemas.openxmlformats.org/drawingml/2006/picture">
+                <pic:pic xmlns:pic="http://schemas.openxmlformats.org/drawingml/2006/picture">
+                  <pic:nvPicPr>
+                    <pic:cNvPr id="577121289" name=""/>
+                    <pic:cNvPicPr/>
+                  </pic:nvPicPr>
+                  <pic:blipFill>
+                    <a:blip r:embed="rId8"/>
+                    <a:stretch>
+                      <a:fillRect/>
+                    </a:stretch>
+                  </pic:blipFill>
+                  <pic:spPr>
+                    <a:xfrm>
+                      <a:off x="0" y="0"/>
+                      <a:ext cx="5612130" cy="2694305"/>
+                    </a:xfrm>
+                    <a:prstGeom prst="rect">
+                      <a:avLst/>
+                    </a:prstGeom>
+                  </pic:spPr>
+                </pic:pic>
+              </a:graphicData>
+            </a:graphic>
+          </wp:inline>
+        </w:drawing>
+      </w:r>
       <w:r>
         <w:br w:type="page"/>
       </w:r>
@@ -285,14 +329,9 @@
           <w:numId w:val="1"/>
         </w:numPr>
       </w:pPr>
-      <w:proofErr w:type="spellStart"/>
       <w:r>
         <w:lastRenderedPageBreak/>
-        <w:t>Analisis</w:t>
-      </w:r>
-      <w:proofErr w:type="spellEnd"/>
-      <w:r>
-        <w:t xml:space="preserve"> de competencia:</w:t>
+        <w:t>Analisis de competencia:</w:t>
       </w:r>
     </w:p>
     <w:p>
@@ -303,13 +342,8 @@
           <w:numId w:val="1"/>
         </w:numPr>
       </w:pPr>
-      <w:proofErr w:type="spellStart"/>
-      <w:r>
-        <w:t>Notion</w:t>
-      </w:r>
-      <w:proofErr w:type="spellEnd"/>
-      <w:r>
-        <w:t>:</w:t>
+      <w:r>
+        <w:t>Notion:</w:t>
       </w:r>
     </w:p>
     <w:p>
@@ -384,15 +418,7 @@
     </w:p>
     <w:p>
       <w:r>
-        <w:t xml:space="preserve">Varias personas pueden editar simultáneamente, similar a Google </w:t>
-      </w:r>
-      <w:proofErr w:type="spellStart"/>
-      <w:r>
-        <w:t>Docs</w:t>
-      </w:r>
-      <w:proofErr w:type="spellEnd"/>
-      <w:r>
-        <w:t>, útil para trabajos grupales.</w:t>
+        <w:t>Varias personas pueden editar simultáneamente, similar a Google Docs, útil para trabajos grupales.</w:t>
       </w:r>
     </w:p>
     <w:p/>
@@ -418,15 +444,7 @@
     </w:p>
     <w:p>
       <w:r>
-        <w:t xml:space="preserve">Puedes conectar apuntes entre sí usando menciones y </w:t>
-      </w:r>
-      <w:proofErr w:type="spellStart"/>
-      <w:r>
-        <w:t>backlinks</w:t>
-      </w:r>
-      <w:proofErr w:type="spellEnd"/>
-      <w:r>
-        <w:t>, creando una especie de “wiki personal”.</w:t>
+        <w:t>Puedes conectar apuntes entre sí usando menciones y backlinks, creando una especie de “wiki personal”.</w:t>
       </w:r>
       <w:r>
         <w:t xml:space="preserve"> </w:t>
@@ -538,21 +556,7 @@
         <w:rPr>
           <w:rFonts w:ascii="Times New Roman" w:hAnsi="Times New Roman" w:cs="Times New Roman"/>
         </w:rPr>
-        <w:t xml:space="preserve">Si alguien no tiene acceso al </w:t>
-      </w:r>
-      <w:proofErr w:type="spellStart"/>
-      <w:r>
-        <w:rPr>
-          <w:rFonts w:ascii="Times New Roman" w:hAnsi="Times New Roman" w:cs="Times New Roman"/>
-        </w:rPr>
-        <w:t>workspace</w:t>
-      </w:r>
-      <w:proofErr w:type="spellEnd"/>
-      <w:r>
-        <w:rPr>
-          <w:rFonts w:ascii="Times New Roman" w:hAnsi="Times New Roman" w:cs="Times New Roman"/>
-        </w:rPr>
-        <w:t xml:space="preserve"> o a la página padre, no podrá encontrar la </w:t>
+        <w:t xml:space="preserve">Si alguien no tiene acceso al workspace o a la página padre, no podrá encontrar la </w:t>
       </w:r>
       <w:proofErr w:type="gramStart"/>
       <w:r>
@@ -669,21 +673,7 @@
         <w:rPr>
           <w:rFonts w:ascii="Times New Roman" w:hAnsi="Times New Roman" w:cs="Times New Roman"/>
         </w:rPr>
-        <w:t xml:space="preserve">compartir </w:t>
-      </w:r>
-      <w:proofErr w:type="spellStart"/>
-      <w:r>
-        <w:rPr>
-          <w:rFonts w:ascii="Times New Roman" w:hAnsi="Times New Roman" w:cs="Times New Roman"/>
-        </w:rPr>
-        <w:t>workspace</w:t>
-      </w:r>
-      <w:proofErr w:type="spellEnd"/>
-      <w:r>
-        <w:rPr>
-          <w:rFonts w:ascii="Times New Roman" w:hAnsi="Times New Roman" w:cs="Times New Roman"/>
-        </w:rPr>
-        <w:t xml:space="preserve">, </w:t>
+        <w:t xml:space="preserve">compartir workspace, </w:t>
       </w:r>
     </w:p>
     <w:p>
@@ -872,27 +862,7 @@
           <w:lang w:eastAsia="es-CO"/>
           <w14:ligatures w14:val="none"/>
         </w:rPr>
-        <w:t xml:space="preserve">Subir apuntes es rápido y no requiere organizar páginas complejas como en </w:t>
-      </w:r>
-      <w:proofErr w:type="spellStart"/>
-      <w:r>
-        <w:rPr>
-          <w:rFonts w:ascii="Times New Roman" w:eastAsia="Times New Roman" w:hAnsi="Times New Roman" w:cs="Times New Roman"/>
-          <w:kern w:val="0"/>
-          <w:lang w:eastAsia="es-CO"/>
-          <w14:ligatures w14:val="none"/>
-        </w:rPr>
-        <w:t>Notion</w:t>
-      </w:r>
-      <w:proofErr w:type="spellEnd"/>
-      <w:r>
-        <w:rPr>
-          <w:rFonts w:ascii="Times New Roman" w:eastAsia="Times New Roman" w:hAnsi="Times New Roman" w:cs="Times New Roman"/>
-          <w:kern w:val="0"/>
-          <w:lang w:eastAsia="es-CO"/>
-          <w14:ligatures w14:val="none"/>
-        </w:rPr>
-        <w:t>. Generalmente basta con subir el archivo y clasificarlo.</w:t>
+        <w:t>Subir apuntes es rápido y no requiere organizar páginas complejas como en Notion. Generalmente basta con subir el archivo y clasificarlo.</w:t>
       </w:r>
     </w:p>
     <w:p>
@@ -1152,9 +1122,9 @@
           <w:lang w:eastAsia="es-CO"/>
           <w14:ligatures w14:val="none"/>
         </w:rPr>
-        <w:t xml:space="preserve">A diferencia de </w:t>
-      </w:r>
-      <w:proofErr w:type="spellStart"/>
+        <w:t xml:space="preserve">A diferencia de Notion, OneNote u Obsidian, Wuolah no está pensado para crear y organizar notas dentro de la plataforma. Es </w:t>
+      </w:r>
+      <w:proofErr w:type="gramStart"/>
       <w:r>
         <w:rPr>
           <w:rFonts w:ascii="Times New Roman" w:eastAsia="Times New Roman" w:hAnsi="Times New Roman" w:cs="Times New Roman"/>
@@ -1164,9 +1134,9 @@
           <w:lang w:eastAsia="es-CO"/>
           <w14:ligatures w14:val="none"/>
         </w:rPr>
-        <w:t>Notion</w:t>
-      </w:r>
-      <w:proofErr w:type="spellEnd"/>
+        <w:t>más</w:t>
+      </w:r>
+      <w:proofErr w:type="gramEnd"/>
       <w:r>
         <w:rPr>
           <w:rFonts w:ascii="Times New Roman" w:eastAsia="Times New Roman" w:hAnsi="Times New Roman" w:cs="Times New Roman"/>
@@ -1176,10 +1146,12 @@
           <w:lang w:eastAsia="es-CO"/>
           <w14:ligatures w14:val="none"/>
         </w:rPr>
-        <w:t xml:space="preserve">, OneNote u Obsidian, Wuolah no está pensado para crear y organizar notas dentro de la plataforma. Es </w:t>
-      </w:r>
-      <w:proofErr w:type="gramStart"/>
-      <w:r>
+        <w:t xml:space="preserve"> un repositorio de archivos.</w:t>
+      </w:r>
+    </w:p>
+    <w:p>
+      <w:pPr>
+        <w:spacing w:after="0" w:line="240" w:lineRule="auto"/>
         <w:rPr>
           <w:rFonts w:ascii="Times New Roman" w:eastAsia="Times New Roman" w:hAnsi="Times New Roman" w:cs="Times New Roman"/>
           <w:b/>
@@ -1188,10 +1160,16 @@
           <w:lang w:eastAsia="es-CO"/>
           <w14:ligatures w14:val="none"/>
         </w:rPr>
-        <w:t>más</w:t>
-      </w:r>
-      <w:proofErr w:type="gramEnd"/>
-      <w:r>
+      </w:pPr>
+    </w:p>
+    <w:p>
+      <w:pPr>
+        <w:pStyle w:val="Prrafodelista"/>
+        <w:numPr>
+          <w:ilvl w:val="0"/>
+          <w:numId w:val="2"/>
+        </w:numPr>
+        <w:spacing w:after="0" w:line="240" w:lineRule="auto"/>
         <w:rPr>
           <w:rFonts w:ascii="Times New Roman" w:eastAsia="Times New Roman" w:hAnsi="Times New Roman" w:cs="Times New Roman"/>
           <w:b/>
@@ -1200,12 +1178,8 @@
           <w:lang w:eastAsia="es-CO"/>
           <w14:ligatures w14:val="none"/>
         </w:rPr>
-        <w:t xml:space="preserve"> un repositorio de archivos.</w:t>
-      </w:r>
-    </w:p>
-    <w:p>
-      <w:pPr>
-        <w:spacing w:after="0" w:line="240" w:lineRule="auto"/>
+      </w:pPr>
+      <w:r>
         <w:rPr>
           <w:rFonts w:ascii="Times New Roman" w:eastAsia="Times New Roman" w:hAnsi="Times New Roman" w:cs="Times New Roman"/>
           <w:b/>
@@ -1214,15 +1188,11 @@
           <w:lang w:eastAsia="es-CO"/>
           <w14:ligatures w14:val="none"/>
         </w:rPr>
-      </w:pPr>
-    </w:p>
-    <w:p>
-      <w:pPr>
-        <w:pStyle w:val="Prrafodelista"/>
-        <w:numPr>
-          <w:ilvl w:val="0"/>
-          <w:numId w:val="2"/>
-        </w:numPr>
+        <w:t>Menos colaboración en tiempo real</w:t>
+      </w:r>
+    </w:p>
+    <w:p>
+      <w:pPr>
         <w:spacing w:after="0" w:line="240" w:lineRule="auto"/>
         <w:rPr>
           <w:rFonts w:ascii="Times New Roman" w:eastAsia="Times New Roman" w:hAnsi="Times New Roman" w:cs="Times New Roman"/>
@@ -1242,79 +1212,7 @@
           <w:lang w:eastAsia="es-CO"/>
           <w14:ligatures w14:val="none"/>
         </w:rPr>
-        <w:t>Menos colaboración en tiempo real</w:t>
-      </w:r>
-    </w:p>
-    <w:p>
-      <w:pPr>
-        <w:spacing w:after="0" w:line="240" w:lineRule="auto"/>
-        <w:rPr>
-          <w:rFonts w:ascii="Times New Roman" w:eastAsia="Times New Roman" w:hAnsi="Times New Roman" w:cs="Times New Roman"/>
-          <w:b/>
-          <w:bCs/>
-          <w:kern w:val="0"/>
-          <w:lang w:eastAsia="es-CO"/>
-          <w14:ligatures w14:val="none"/>
-        </w:rPr>
-      </w:pPr>
-      <w:r>
-        <w:rPr>
-          <w:rFonts w:ascii="Times New Roman" w:eastAsia="Times New Roman" w:hAnsi="Times New Roman" w:cs="Times New Roman"/>
-          <w:b/>
-          <w:bCs/>
-          <w:kern w:val="0"/>
-          <w:lang w:eastAsia="es-CO"/>
-          <w14:ligatures w14:val="none"/>
-        </w:rPr>
-        <w:t xml:space="preserve">No tiene edición colaborativa avanzada tipo Google </w:t>
-      </w:r>
-      <w:proofErr w:type="spellStart"/>
-      <w:r>
-        <w:rPr>
-          <w:rFonts w:ascii="Times New Roman" w:eastAsia="Times New Roman" w:hAnsi="Times New Roman" w:cs="Times New Roman"/>
-          <w:b/>
-          <w:bCs/>
-          <w:kern w:val="0"/>
-          <w:lang w:eastAsia="es-CO"/>
-          <w14:ligatures w14:val="none"/>
-        </w:rPr>
-        <w:t>Docs</w:t>
-      </w:r>
-      <w:proofErr w:type="spellEnd"/>
-      <w:r>
-        <w:rPr>
-          <w:rFonts w:ascii="Times New Roman" w:eastAsia="Times New Roman" w:hAnsi="Times New Roman" w:cs="Times New Roman"/>
-          <w:b/>
-          <w:bCs/>
-          <w:kern w:val="0"/>
-          <w:lang w:eastAsia="es-CO"/>
-          <w14:ligatures w14:val="none"/>
-        </w:rPr>
-        <w:t xml:space="preserve"> o </w:t>
-      </w:r>
-      <w:proofErr w:type="spellStart"/>
-      <w:r>
-        <w:rPr>
-          <w:rFonts w:ascii="Times New Roman" w:eastAsia="Times New Roman" w:hAnsi="Times New Roman" w:cs="Times New Roman"/>
-          <w:b/>
-          <w:bCs/>
-          <w:kern w:val="0"/>
-          <w:lang w:eastAsia="es-CO"/>
-          <w14:ligatures w14:val="none"/>
-        </w:rPr>
-        <w:t>Notion</w:t>
-      </w:r>
-      <w:proofErr w:type="spellEnd"/>
-      <w:r>
-        <w:rPr>
-          <w:rFonts w:ascii="Times New Roman" w:eastAsia="Times New Roman" w:hAnsi="Times New Roman" w:cs="Times New Roman"/>
-          <w:b/>
-          <w:bCs/>
-          <w:kern w:val="0"/>
-          <w:lang w:eastAsia="es-CO"/>
-          <w14:ligatures w14:val="none"/>
-        </w:rPr>
-        <w:t>.</w:t>
+        <w:t>No tiene edición colaborativa avanzada tipo Google Docs o Notion.</w:t>
       </w:r>
     </w:p>
     <w:p>
@@ -1402,14 +1300,9 @@
           <w:numId w:val="1"/>
         </w:numPr>
       </w:pPr>
-      <w:proofErr w:type="spellStart"/>
       <w:r>
         <w:lastRenderedPageBreak/>
-        <w:t>Sitemap</w:t>
-      </w:r>
-      <w:proofErr w:type="spellEnd"/>
-      <w:r>
-        <w:t>:</w:t>
+        <w:t>Sitemap:</w:t>
       </w:r>
     </w:p>
     <w:p/>
@@ -1502,11 +1395,9 @@
             <w:hideMark/>
           </w:tcPr>
           <w:p>
-            <w:proofErr w:type="spellStart"/>
             <w:r>
               <w:t>Frontend</w:t>
             </w:r>
-            <w:proofErr w:type="spellEnd"/>
           </w:p>
         </w:tc>
         <w:tc>
@@ -1533,13 +1424,8 @@
             <w:hideMark/>
           </w:tcPr>
           <w:p>
-            <w:proofErr w:type="spellStart"/>
-            <w:r>
-              <w:t>Backend</w:t>
-            </w:r>
-            <w:proofErr w:type="spellEnd"/>
-            <w:r>
-              <w:t>/BaaS</w:t>
+            <w:r>
+              <w:t>Backend/BaaS</w:t>
             </w:r>
           </w:p>
         </w:tc>
@@ -1550,11 +1436,9 @@
             <w:hideMark/>
           </w:tcPr>
           <w:p>
-            <w:proofErr w:type="spellStart"/>
             <w:r>
               <w:t>Supabase</w:t>
             </w:r>
-            <w:proofErr w:type="spellEnd"/>
           </w:p>
         </w:tc>
       </w:tr>
@@ -1581,13 +1465,8 @@
             <w:hideMark/>
           </w:tcPr>
           <w:p>
-            <w:proofErr w:type="spellStart"/>
-            <w:r>
-              <w:t>Supabase</w:t>
-            </w:r>
-            <w:proofErr w:type="spellEnd"/>
-            <w:r>
-              <w:t xml:space="preserve"> Auth + Google OAuth 2.0</w:t>
+            <w:r>
+              <w:t>Supabase Auth + Google OAuth 2.0</w:t>
             </w:r>
           </w:p>
         </w:tc>
@@ -1616,15 +1495,7 @@
           </w:tcPr>
           <w:p>
             <w:r>
-              <w:t xml:space="preserve">PostgreSQL (vía </w:t>
-            </w:r>
-            <w:proofErr w:type="spellStart"/>
-            <w:r>
-              <w:t>Supabase</w:t>
-            </w:r>
-            <w:proofErr w:type="spellEnd"/>
-            <w:r>
-              <w:t>)</w:t>
+              <w:t>PostgreSQL (vía Supabase)</w:t>
             </w:r>
           </w:p>
         </w:tc>
@@ -1652,13 +1523,8 @@
             <w:hideMark/>
           </w:tcPr>
           <w:p>
-            <w:proofErr w:type="spellStart"/>
-            <w:r>
-              <w:t>Supabase</w:t>
-            </w:r>
-            <w:proofErr w:type="spellEnd"/>
-            <w:r>
-              <w:t xml:space="preserve"> Storage</w:t>
+            <w:r>
+              <w:t>Supabase Storage</w:t>
             </w:r>
           </w:p>
         </w:tc>
@@ -1722,15 +1588,7 @@
     <w:p/>
     <w:p>
       <w:r>
-        <w:t xml:space="preserve">Fase 1 — </w:t>
-      </w:r>
-      <w:proofErr w:type="spellStart"/>
-      <w:r>
-        <w:t>Pre-lanzamiento</w:t>
-      </w:r>
-      <w:proofErr w:type="spellEnd"/>
-      <w:r>
-        <w:t xml:space="preserve"> (</w:t>
+        <w:t>Fase 1 — Pre-lanzamiento (</w:t>
       </w:r>
     </w:p>
     <w:p>
@@ -1760,15 +1618,7 @@
         </w:numPr>
       </w:pPr>
       <w:r>
-        <w:t xml:space="preserve">Publicar en grupos de WhatsApp y </w:t>
-      </w:r>
-      <w:proofErr w:type="spellStart"/>
-      <w:r>
-        <w:t>Telegram</w:t>
-      </w:r>
-      <w:proofErr w:type="spellEnd"/>
-      <w:r>
-        <w:t xml:space="preserve"> de tu facultad contando que viene algo nuevo para compartir apuntes</w:t>
+        <w:t>Publicar en grupos de WhatsApp y Telegram de tu facultad contando que viene algo nuevo para compartir apuntes</w:t>
       </w:r>
     </w:p>
     <w:p>
@@ -1832,7 +1682,7 @@
                     <pic:cNvPicPr/>
                   </pic:nvPicPr>
                   <pic:blipFill>
-                    <a:blip r:embed="rId7"/>
+                    <a:blip r:embed="rId9"/>
                     <a:stretch>
                       <a:fillRect/>
                     </a:stretch>
@@ -1902,15 +1752,7 @@
         <w:pStyle w:val="font-claude-response-body"/>
       </w:pPr>
       <w:r>
-        <w:t xml:space="preserve">Todo </w:t>
-      </w:r>
-      <w:proofErr w:type="spellStart"/>
-      <w:r>
-        <w:t>feedback</w:t>
-      </w:r>
-      <w:proofErr w:type="spellEnd"/>
-      <w:r>
-        <w:t xml:space="preserve"> se clasifica en tres categorías: error crítico (atención inmediata), mejora importante (próximo sprint) o idea futura (backlog).</w:t>
+        <w:t>Todo feedback se clasifica en tres categorías: error crítico (atención inmediata), mejora importante (próximo sprint) o idea futura (backlog).</w:t>
       </w:r>
     </w:p>
     <w:p>
@@ -1931,23 +1773,7 @@
         <w:pStyle w:val="font-claude-response-body"/>
       </w:pPr>
       <w:r>
-        <w:t xml:space="preserve">Se maneja en tres niveles: errores críticos se resuelven en menos de 48 horas, una revisión mensual verifica </w:t>
-      </w:r>
-      <w:proofErr w:type="spellStart"/>
-      <w:r>
-        <w:t>APIs</w:t>
-      </w:r>
-      <w:proofErr w:type="spellEnd"/>
-      <w:r>
-        <w:t xml:space="preserve">, </w:t>
-      </w:r>
-      <w:proofErr w:type="spellStart"/>
-      <w:r>
-        <w:t>Firebase</w:t>
-      </w:r>
-      <w:proofErr w:type="spellEnd"/>
-      <w:r>
-        <w:t xml:space="preserve"> y seguridad, y cada 2-3 meses se actualizan dependencias y se revisa el rendimiento con Google Lighthouse.</w:t>
+        <w:t>Se maneja en tres niveles: errores críticos se resuelven en menos de 48 horas, una revisión mensual verifica APIs, Firebase y seguridad, y cada 2-3 meses se actualizan dependencias y se revisa el rendimiento con Google Lighthouse.</w:t>
       </w:r>
     </w:p>
     <w:p>
@@ -1968,15 +1794,7 @@
         <w:pStyle w:val="font-claude-response-body"/>
       </w:pPr>
       <w:r>
-        <w:t xml:space="preserve">Cada dos meses se analiza qué pantallas generan abandono y qué funciones no se usan, usando Google </w:t>
-      </w:r>
-      <w:proofErr w:type="spellStart"/>
-      <w:r>
-        <w:t>Analytics</w:t>
-      </w:r>
-      <w:proofErr w:type="spellEnd"/>
-      <w:r>
-        <w:t xml:space="preserve"> (gratuito). Con esos datos se prototipa, implementa y mide el impacto del cambio antes de continuar.</w:t>
+        <w:t>Cada dos meses se analiza qué pantallas generan abandono y qué funciones no se usan, usando Google Analytics (gratuito). Con esos datos se prototipa, implementa y mide el impacto del cambio antes de continuar.</w:t>
       </w:r>
     </w:p>
     <w:p>
@@ -2090,35 +1908,7 @@
         <w:rPr>
           <w:rFonts w:ascii="Times New Roman" w:hAnsi="Times New Roman" w:cs="Times New Roman"/>
         </w:rPr>
-        <w:t xml:space="preserve">En el </w:t>
-      </w:r>
-      <w:proofErr w:type="spellStart"/>
-      <w:r>
-        <w:rPr>
-          <w:rFonts w:ascii="Times New Roman" w:hAnsi="Times New Roman" w:cs="Times New Roman"/>
-        </w:rPr>
-        <w:t>feed</w:t>
-      </w:r>
-      <w:proofErr w:type="spellEnd"/>
-      <w:r>
-        <w:rPr>
-          <w:rFonts w:ascii="Times New Roman" w:hAnsi="Times New Roman" w:cs="Times New Roman"/>
-        </w:rPr>
-        <w:t xml:space="preserve"> principal: un </w:t>
-      </w:r>
-      <w:proofErr w:type="spellStart"/>
-      <w:r>
-        <w:rPr>
-          <w:rFonts w:ascii="Times New Roman" w:hAnsi="Times New Roman" w:cs="Times New Roman"/>
-        </w:rPr>
-        <w:t>card</w:t>
-      </w:r>
-      <w:proofErr w:type="spellEnd"/>
-      <w:r>
-        <w:rPr>
-          <w:rFonts w:ascii="Times New Roman" w:hAnsi="Times New Roman" w:cs="Times New Roman"/>
-        </w:rPr>
-        <w:t xml:space="preserve"> publicitario cada 8-10 apuntes, visualmente diferenciado del contenido real</w:t>
+        <w:t>En el feed principal: un card publicitario cada 8-10 apuntes, visualmente diferenciado del contenido real</w:t>
       </w:r>
     </w:p>
     <w:p>
@@ -2298,21 +2088,7 @@
         <w:rPr>
           <w:rFonts w:ascii="Times New Roman" w:hAnsi="Times New Roman" w:cs="Times New Roman"/>
         </w:rPr>
-        <w:t xml:space="preserve">Se transfiere por </w:t>
-      </w:r>
-      <w:proofErr w:type="spellStart"/>
-      <w:r>
-        <w:rPr>
-          <w:rFonts w:ascii="Times New Roman" w:hAnsi="Times New Roman" w:cs="Times New Roman"/>
-        </w:rPr>
-        <w:t>Nequi</w:t>
-      </w:r>
-      <w:proofErr w:type="spellEnd"/>
-      <w:r>
-        <w:rPr>
-          <w:rFonts w:ascii="Times New Roman" w:hAnsi="Times New Roman" w:cs="Times New Roman"/>
-        </w:rPr>
-        <w:t xml:space="preserve"> o Bancolombia</w:t>
+        <w:t>Se transfiere por Nequi o Bancolombia</w:t>
       </w:r>
     </w:p>
     <w:p>
@@ -2362,21 +2138,7 @@
         <w:rPr>
           <w:rFonts w:ascii="Times New Roman" w:hAnsi="Times New Roman" w:cs="Times New Roman"/>
         </w:rPr>
-        <w:t xml:space="preserve"> como </w:t>
-      </w:r>
-      <w:proofErr w:type="spellStart"/>
-      <w:r>
-        <w:rPr>
-          <w:rFonts w:ascii="Times New Roman" w:hAnsi="Times New Roman" w:cs="Times New Roman"/>
-        </w:rPr>
-        <w:t>Ko</w:t>
-      </w:r>
-      <w:proofErr w:type="spellEnd"/>
-      <w:r>
-        <w:rPr>
-          <w:rFonts w:ascii="Times New Roman" w:hAnsi="Times New Roman" w:cs="Times New Roman"/>
-        </w:rPr>
-        <w:t>-fi o Buy Me a Coffee demuestran que los usuarios sí pagan propinas cuando el contenido les ahorra tiempo o esfuerzo. En el contexto universitario colombiano, donde los estudiantes tienen presupuesto limitado, la propina opcional de $500 COP es una barrera de entrada muy baja que no genera rechazo.</w:t>
+        <w:t xml:space="preserve"> como Ko-fi o Buy Me a Coffee demuestran que los usuarios sí pagan propinas cuando el contenido les ahorra tiempo o esfuerzo. En el contexto universitario colombiano, donde los estudiantes tienen presupuesto limitado, la propina opcional de $500 COP es una barrera de entrada muy baja que no genera rechazo.</w:t>
       </w:r>
     </w:p>
     <w:p>
@@ -2858,13 +2620,8 @@
           </w:tcPr>
           <w:p>
             <w:r>
-              <w:t xml:space="preserve">Sesión sigue activa, no pide </w:t>
-            </w:r>
-            <w:proofErr w:type="spellStart"/>
-            <w:r>
-              <w:t>login</w:t>
-            </w:r>
-            <w:proofErr w:type="spellEnd"/>
+              <w:t>Sesión sigue activa, no pide login</w:t>
+            </w:r>
           </w:p>
         </w:tc>
         <w:tc>
@@ -3236,13 +2993,8 @@
           </w:tcPr>
           <w:p>
             <w:r>
-              <w:t>1. Seleccionar archivo .docx o .</w:t>
-            </w:r>
-            <w:proofErr w:type="spellStart"/>
-            <w:r>
-              <w:t>jpg</w:t>
-            </w:r>
-            <w:proofErr w:type="spellEnd"/>
+              <w:t>1. Seleccionar archivo .docx o .jpg</w:t>
+            </w:r>
           </w:p>
         </w:tc>
         <w:tc>
@@ -3383,35 +3135,19 @@
           </w:tcPr>
           <w:p>
             <w:r>
-              <w:t xml:space="preserve">1. Clic en cualquier </w:t>
-            </w:r>
-            <w:proofErr w:type="spellStart"/>
-            <w:r>
-              <w:t>card</w:t>
-            </w:r>
-            <w:proofErr w:type="spellEnd"/>
-            <w:r>
-              <w:t xml:space="preserve"> de apunte</w:t>
-            </w:r>
-          </w:p>
-        </w:tc>
-        <w:tc>
-          <w:tcPr>
-            <w:tcW w:w="0" w:type="auto"/>
-            <w:vAlign w:val="center"/>
-            <w:hideMark/>
-          </w:tcPr>
-          <w:p>
-            <w:r>
-              <w:t xml:space="preserve">Carga página detalle con </w:t>
-            </w:r>
-            <w:proofErr w:type="spellStart"/>
-            <w:r>
-              <w:t>iframe</w:t>
-            </w:r>
-            <w:proofErr w:type="spellEnd"/>
-            <w:r>
-              <w:t xml:space="preserve"> del PDF</w:t>
+              <w:t>1. Clic en cualquier card de apunte</w:t>
+            </w:r>
+          </w:p>
+        </w:tc>
+        <w:tc>
+          <w:tcPr>
+            <w:tcW w:w="0" w:type="auto"/>
+            <w:vAlign w:val="center"/>
+            <w:hideMark/>
+          </w:tcPr>
+          <w:p>
+            <w:r>
+              <w:t>Carga página detalle con iframe del PDF</w:t>
             </w:r>
           </w:p>
         </w:tc>
@@ -3553,13 +3289,8 @@
           </w:tcPr>
           <w:p>
             <w:r>
-              <w:t xml:space="preserve">Elimina apunte, redirige a </w:t>
-            </w:r>
-            <w:proofErr w:type="spellStart"/>
-            <w:r>
-              <w:t>index</w:t>
-            </w:r>
-            <w:proofErr w:type="spellEnd"/>
+              <w:t>Elimina apunte, redirige a index</w:t>
+            </w:r>
           </w:p>
         </w:tc>
         <w:tc>
@@ -3851,15 +3582,7 @@
           </w:tcPr>
           <w:p>
             <w:r>
-              <w:t xml:space="preserve">Filtra resultados en tiempo real (400ms </w:t>
-            </w:r>
-            <w:proofErr w:type="spellStart"/>
-            <w:r>
-              <w:t>debounce</w:t>
-            </w:r>
-            <w:proofErr w:type="spellEnd"/>
-            <w:r>
-              <w:t>)</w:t>
+              <w:t>Filtra resultados en tiempo real (400ms debounce)</w:t>
             </w:r>
           </w:p>
         </w:tc>
@@ -3918,13 +3641,8 @@
           </w:tcPr>
           <w:p>
             <w:r>
-              <w:t xml:space="preserve">1. Seleccionar carrera en </w:t>
-            </w:r>
-            <w:proofErr w:type="spellStart"/>
-            <w:r>
-              <w:t>dropdown</w:t>
-            </w:r>
-            <w:proofErr w:type="spellEnd"/>
+              <w:t>1. Seleccionar carrera en dropdown</w:t>
+            </w:r>
           </w:p>
         </w:tc>
         <w:tc>
@@ -4077,21 +3795,8 @@
           </w:tcPr>
           <w:p>
             <w:r>
-              <w:t xml:space="preserve">Reordena lista por </w:t>
-            </w:r>
-            <w:proofErr w:type="spellStart"/>
-            <w:r>
-              <w:t>total_descargas</w:t>
-            </w:r>
-            <w:proofErr w:type="spellEnd"/>
-            <w:r>
-              <w:t xml:space="preserve"> </w:t>
-            </w:r>
-            <w:proofErr w:type="spellStart"/>
-            <w:r>
-              <w:t>desc</w:t>
-            </w:r>
-            <w:proofErr w:type="spellEnd"/>
+              <w:t>Reordena lista por total_descargas desc</w:t>
+            </w:r>
           </w:p>
         </w:tc>
         <w:tc>
@@ -5250,13 +4955,8 @@
           </w:tcPr>
           <w:p>
             <w:r>
-              <w:t xml:space="preserve">Acceso con cuenta </w:t>
-            </w:r>
-            <w:proofErr w:type="spellStart"/>
-            <w:r>
-              <w:t>admin</w:t>
-            </w:r>
-            <w:proofErr w:type="spellEnd"/>
+              <w:t>Acceso con cuenta admin</w:t>
+            </w:r>
           </w:p>
         </w:tc>
         <w:tc>
@@ -5269,7 +4969,7 @@
             <w:r>
               <w:t xml:space="preserve">1. Login con </w:t>
             </w:r>
-            <w:hyperlink r:id="rId8" w:history="1">
+            <w:hyperlink r:id="rId10" w:history="1">
               <w:r>
                 <w:rPr>
                   <w:rStyle w:val="Hipervnculo"/>
@@ -5337,13 +5037,8 @@
           </w:tcPr>
           <w:p>
             <w:r>
-              <w:t xml:space="preserve">Acceso denegado a no </w:t>
-            </w:r>
-            <w:proofErr w:type="spellStart"/>
-            <w:r>
-              <w:t>admin</w:t>
-            </w:r>
-            <w:proofErr w:type="spellEnd"/>
+              <w:t>Acceso denegado a no admin</w:t>
+            </w:r>
           </w:p>
         </w:tc>
         <w:tc>
@@ -5413,13 +5108,8 @@
           </w:tcPr>
           <w:p>
             <w:r>
-              <w:t xml:space="preserve">Eliminar apunte desde </w:t>
-            </w:r>
-            <w:proofErr w:type="spellStart"/>
-            <w:r>
-              <w:t>admin</w:t>
-            </w:r>
-            <w:proofErr w:type="spellEnd"/>
+              <w:t>Eliminar apunte desde admin</w:t>
+            </w:r>
           </w:p>
         </w:tc>
         <w:tc>
@@ -5492,31 +5182,18 @@
       </w:pPr>
       <w:r>
         <w:lastRenderedPageBreak/>
-        <w:t xml:space="preserve">12. </w:t>
-      </w:r>
-      <w:r>
-        <w:t>API Externa Integrada</w:t>
-      </w:r>
-    </w:p>
-    <w:p>
-      <w:proofErr w:type="spellStart"/>
-      <w:r>
-        <w:t>Supabase</w:t>
-      </w:r>
-      <w:proofErr w:type="spellEnd"/>
-      <w:r>
-        <w:t xml:space="preserve"> actúa como API externa REST completa:</w:t>
+        <w:t>12. API Externa Integrada</w:t>
+      </w:r>
+    </w:p>
+    <w:p>
+      <w:r>
+        <w:t>Supabase actúa como API externa REST completa:</w:t>
       </w:r>
     </w:p>
     <w:p/>
     <w:p>
-      <w:proofErr w:type="spellStart"/>
-      <w:r>
-        <w:t>Endpoint</w:t>
-      </w:r>
-      <w:proofErr w:type="spellEnd"/>
-      <w:r>
-        <w:t xml:space="preserve"> base: https://ojwnvijcyrddpadyyoce.supabase.co/rest/v1/</w:t>
+      <w:r>
+        <w:t>Endpoint base: https://ojwnvijcyrddpadyyoce.supabase.co/rest/v1/</w:t>
       </w:r>
     </w:p>
     <w:p>
@@ -5531,15 +5208,7 @@
     </w:p>
     <w:p>
       <w:r>
-        <w:t xml:space="preserve">Storage API: </w:t>
-      </w:r>
-      <w:proofErr w:type="spellStart"/>
-      <w:r>
-        <w:t>Upload</w:t>
-      </w:r>
-      <w:proofErr w:type="spellEnd"/>
-      <w:r>
-        <w:t xml:space="preserve"> y descarga de archivos PDF</w:t>
+        <w:t>Storage API: Upload y descarga de archivos PDF</w:t>
       </w:r>
     </w:p>
     <w:p>
@@ -5550,15 +5219,7 @@
     <w:p/>
     <w:p>
       <w:r>
-        <w:t xml:space="preserve">Adicionalmente se usa la API pública de UI </w:t>
-      </w:r>
-      <w:proofErr w:type="spellStart"/>
-      <w:r>
-        <w:t>Avatars</w:t>
-      </w:r>
-      <w:proofErr w:type="spellEnd"/>
-      <w:r>
-        <w:t xml:space="preserve"> (https://ui-avatars.com/api/) para generar avatares automáticos cuando el usuario no tiene foto de perfil de Google.</w:t>
+        <w:t>Adicionalmente se usa la API pública de UI Avatars (https://ui-avatars.com/api/) para generar avatares automáticos cuando el usuario no tiene foto de perfil de Google.</w:t>
       </w:r>
     </w:p>
     <w:p>
@@ -5702,11 +5363,9 @@
             <w:hideMark/>
           </w:tcPr>
           <w:p>
-            <w:proofErr w:type="spellStart"/>
             <w:r>
               <w:t>uuid</w:t>
             </w:r>
-            <w:proofErr w:type="spellEnd"/>
           </w:p>
         </w:tc>
         <w:tc>
@@ -5745,11 +5404,9 @@
             <w:hideMark/>
           </w:tcPr>
           <w:p>
-            <w:proofErr w:type="spellStart"/>
             <w:r>
               <w:t>text</w:t>
             </w:r>
-            <w:proofErr w:type="spellEnd"/>
           </w:p>
         </w:tc>
         <w:tc>
@@ -5776,25 +5433,21 @@
             <w:hideMark/>
           </w:tcPr>
           <w:p>
-            <w:proofErr w:type="spellStart"/>
             <w:r>
               <w:t>descripcion</w:t>
             </w:r>
-            <w:proofErr w:type="spellEnd"/>
-          </w:p>
-        </w:tc>
-        <w:tc>
-          <w:tcPr>
-            <w:tcW w:w="0" w:type="auto"/>
-            <w:vAlign w:val="center"/>
-            <w:hideMark/>
-          </w:tcPr>
-          <w:p>
-            <w:proofErr w:type="spellStart"/>
+          </w:p>
+        </w:tc>
+        <w:tc>
+          <w:tcPr>
+            <w:tcW w:w="0" w:type="auto"/>
+            <w:vAlign w:val="center"/>
+            <w:hideMark/>
+          </w:tcPr>
+          <w:p>
             <w:r>
               <w:t>text</w:t>
             </w:r>
-            <w:proofErr w:type="spellEnd"/>
           </w:p>
         </w:tc>
         <w:tc>
@@ -5833,11 +5486,9 @@
             <w:hideMark/>
           </w:tcPr>
           <w:p>
-            <w:proofErr w:type="spellStart"/>
             <w:r>
               <w:t>text</w:t>
             </w:r>
-            <w:proofErr w:type="spellEnd"/>
           </w:p>
         </w:tc>
         <w:tc>
@@ -5876,11 +5527,9 @@
             <w:hideMark/>
           </w:tcPr>
           <w:p>
-            <w:proofErr w:type="spellStart"/>
             <w:r>
               <w:t>text</w:t>
             </w:r>
-            <w:proofErr w:type="spellEnd"/>
           </w:p>
         </w:tc>
         <w:tc>
@@ -5907,25 +5556,21 @@
             <w:hideMark/>
           </w:tcPr>
           <w:p>
-            <w:proofErr w:type="spellStart"/>
             <w:r>
               <w:t>archivo_url</w:t>
             </w:r>
-            <w:proofErr w:type="spellEnd"/>
-          </w:p>
-        </w:tc>
-        <w:tc>
-          <w:tcPr>
-            <w:tcW w:w="0" w:type="auto"/>
-            <w:vAlign w:val="center"/>
-            <w:hideMark/>
-          </w:tcPr>
-          <w:p>
-            <w:proofErr w:type="spellStart"/>
+          </w:p>
+        </w:tc>
+        <w:tc>
+          <w:tcPr>
+            <w:tcW w:w="0" w:type="auto"/>
+            <w:vAlign w:val="center"/>
+            <w:hideMark/>
+          </w:tcPr>
+          <w:p>
             <w:r>
               <w:t>text</w:t>
             </w:r>
-            <w:proofErr w:type="spellEnd"/>
           </w:p>
         </w:tc>
         <w:tc>
@@ -5952,25 +5597,21 @@
             <w:hideMark/>
           </w:tcPr>
           <w:p>
-            <w:proofErr w:type="spellStart"/>
             <w:r>
               <w:t>usuario_id</w:t>
             </w:r>
-            <w:proofErr w:type="spellEnd"/>
-          </w:p>
-        </w:tc>
-        <w:tc>
-          <w:tcPr>
-            <w:tcW w:w="0" w:type="auto"/>
-            <w:vAlign w:val="center"/>
-            <w:hideMark/>
-          </w:tcPr>
-          <w:p>
-            <w:proofErr w:type="spellStart"/>
+          </w:p>
+        </w:tc>
+        <w:tc>
+          <w:tcPr>
+            <w:tcW w:w="0" w:type="auto"/>
+            <w:vAlign w:val="center"/>
+            <w:hideMark/>
+          </w:tcPr>
+          <w:p>
             <w:r>
               <w:t>uuid</w:t>
             </w:r>
-            <w:proofErr w:type="spellEnd"/>
           </w:p>
         </w:tc>
         <w:tc>
@@ -5997,25 +5638,21 @@
             <w:hideMark/>
           </w:tcPr>
           <w:p>
-            <w:proofErr w:type="spellStart"/>
             <w:r>
               <w:t>usuario_nombre</w:t>
             </w:r>
-            <w:proofErr w:type="spellEnd"/>
-          </w:p>
-        </w:tc>
-        <w:tc>
-          <w:tcPr>
-            <w:tcW w:w="0" w:type="auto"/>
-            <w:vAlign w:val="center"/>
-            <w:hideMark/>
-          </w:tcPr>
-          <w:p>
-            <w:proofErr w:type="spellStart"/>
+          </w:p>
+        </w:tc>
+        <w:tc>
+          <w:tcPr>
+            <w:tcW w:w="0" w:type="auto"/>
+            <w:vAlign w:val="center"/>
+            <w:hideMark/>
+          </w:tcPr>
+          <w:p>
             <w:r>
               <w:t>text</w:t>
             </w:r>
-            <w:proofErr w:type="spellEnd"/>
           </w:p>
         </w:tc>
         <w:tc>
@@ -6042,25 +5679,21 @@
             <w:hideMark/>
           </w:tcPr>
           <w:p>
-            <w:proofErr w:type="spellStart"/>
             <w:r>
               <w:t>usuario_avatar</w:t>
             </w:r>
-            <w:proofErr w:type="spellEnd"/>
-          </w:p>
-        </w:tc>
-        <w:tc>
-          <w:tcPr>
-            <w:tcW w:w="0" w:type="auto"/>
-            <w:vAlign w:val="center"/>
-            <w:hideMark/>
-          </w:tcPr>
-          <w:p>
-            <w:proofErr w:type="spellStart"/>
+          </w:p>
+        </w:tc>
+        <w:tc>
+          <w:tcPr>
+            <w:tcW w:w="0" w:type="auto"/>
+            <w:vAlign w:val="center"/>
+            <w:hideMark/>
+          </w:tcPr>
+          <w:p>
             <w:r>
               <w:t>text</w:t>
             </w:r>
-            <w:proofErr w:type="spellEnd"/>
           </w:p>
         </w:tc>
         <w:tc>
@@ -6087,11 +5720,9 @@
             <w:hideMark/>
           </w:tcPr>
           <w:p>
-            <w:proofErr w:type="spellStart"/>
             <w:r>
               <w:t>valoracion_promedio</w:t>
             </w:r>
-            <w:proofErr w:type="spellEnd"/>
           </w:p>
         </w:tc>
         <w:tc>
@@ -6130,11 +5761,9 @@
             <w:hideMark/>
           </w:tcPr>
           <w:p>
-            <w:proofErr w:type="spellStart"/>
             <w:r>
               <w:t>total_descargas</w:t>
             </w:r>
-            <w:proofErr w:type="spellEnd"/>
           </w:p>
         </w:tc>
         <w:tc>
@@ -6173,25 +5802,21 @@
             <w:hideMark/>
           </w:tcPr>
           <w:p>
-            <w:proofErr w:type="spellStart"/>
             <w:r>
               <w:t>created_at</w:t>
             </w:r>
-            <w:proofErr w:type="spellEnd"/>
-          </w:p>
-        </w:tc>
-        <w:tc>
-          <w:tcPr>
-            <w:tcW w:w="0" w:type="auto"/>
-            <w:vAlign w:val="center"/>
-            <w:hideMark/>
-          </w:tcPr>
-          <w:p>
-            <w:proofErr w:type="spellStart"/>
+          </w:p>
+        </w:tc>
+        <w:tc>
+          <w:tcPr>
+            <w:tcW w:w="0" w:type="auto"/>
+            <w:vAlign w:val="center"/>
+            <w:hideMark/>
+          </w:tcPr>
+          <w:p>
             <w:r>
               <w:t>timestamptz</w:t>
             </w:r>
-            <w:proofErr w:type="spellEnd"/>
           </w:p>
         </w:tc>
         <w:tc>
@@ -6331,11 +5956,9 @@
             <w:hideMark/>
           </w:tcPr>
           <w:p>
-            <w:proofErr w:type="spellStart"/>
             <w:r>
               <w:t>uuid</w:t>
             </w:r>
-            <w:proofErr w:type="spellEnd"/>
           </w:p>
         </w:tc>
         <w:tc>
@@ -6362,25 +5985,21 @@
             <w:hideMark/>
           </w:tcPr>
           <w:p>
-            <w:proofErr w:type="spellStart"/>
             <w:r>
               <w:t>apunte_id</w:t>
             </w:r>
-            <w:proofErr w:type="spellEnd"/>
-          </w:p>
-        </w:tc>
-        <w:tc>
-          <w:tcPr>
-            <w:tcW w:w="0" w:type="auto"/>
-            <w:vAlign w:val="center"/>
-            <w:hideMark/>
-          </w:tcPr>
-          <w:p>
-            <w:proofErr w:type="spellStart"/>
+          </w:p>
+        </w:tc>
+        <w:tc>
+          <w:tcPr>
+            <w:tcW w:w="0" w:type="auto"/>
+            <w:vAlign w:val="center"/>
+            <w:hideMark/>
+          </w:tcPr>
+          <w:p>
             <w:r>
               <w:t>uuid</w:t>
             </w:r>
-            <w:proofErr w:type="spellEnd"/>
           </w:p>
         </w:tc>
         <w:tc>
@@ -6407,25 +6026,21 @@
             <w:hideMark/>
           </w:tcPr>
           <w:p>
-            <w:proofErr w:type="spellStart"/>
             <w:r>
               <w:t>usuario_id</w:t>
             </w:r>
-            <w:proofErr w:type="spellEnd"/>
-          </w:p>
-        </w:tc>
-        <w:tc>
-          <w:tcPr>
-            <w:tcW w:w="0" w:type="auto"/>
-            <w:vAlign w:val="center"/>
-            <w:hideMark/>
-          </w:tcPr>
-          <w:p>
-            <w:proofErr w:type="spellStart"/>
+          </w:p>
+        </w:tc>
+        <w:tc>
+          <w:tcPr>
+            <w:tcW w:w="0" w:type="auto"/>
+            <w:vAlign w:val="center"/>
+            <w:hideMark/>
+          </w:tcPr>
+          <w:p>
             <w:r>
               <w:t>uuid</w:t>
             </w:r>
-            <w:proofErr w:type="spellEnd"/>
           </w:p>
         </w:tc>
         <w:tc>
@@ -6493,25 +6108,21 @@
             <w:hideMark/>
           </w:tcPr>
           <w:p>
-            <w:proofErr w:type="spellStart"/>
             <w:r>
               <w:t>created_at</w:t>
             </w:r>
-            <w:proofErr w:type="spellEnd"/>
-          </w:p>
-        </w:tc>
-        <w:tc>
-          <w:tcPr>
-            <w:tcW w:w="0" w:type="auto"/>
-            <w:vAlign w:val="center"/>
-            <w:hideMark/>
-          </w:tcPr>
-          <w:p>
-            <w:proofErr w:type="spellStart"/>
+          </w:p>
+        </w:tc>
+        <w:tc>
+          <w:tcPr>
+            <w:tcW w:w="0" w:type="auto"/>
+            <w:vAlign w:val="center"/>
+            <w:hideMark/>
+          </w:tcPr>
+          <w:p>
             <w:r>
               <w:t>timestamptz</w:t>
             </w:r>
-            <w:proofErr w:type="spellEnd"/>
           </w:p>
         </w:tc>
         <w:tc>
@@ -6652,11 +6263,9 @@
             <w:hideMark/>
           </w:tcPr>
           <w:p>
-            <w:proofErr w:type="spellStart"/>
             <w:r>
               <w:t>uuid</w:t>
             </w:r>
-            <w:proofErr w:type="spellEnd"/>
           </w:p>
         </w:tc>
         <w:tc>
@@ -6683,25 +6292,21 @@
             <w:hideMark/>
           </w:tcPr>
           <w:p>
-            <w:proofErr w:type="spellStart"/>
             <w:r>
               <w:t>usuario_id</w:t>
             </w:r>
-            <w:proofErr w:type="spellEnd"/>
-          </w:p>
-        </w:tc>
-        <w:tc>
-          <w:tcPr>
-            <w:tcW w:w="0" w:type="auto"/>
-            <w:vAlign w:val="center"/>
-            <w:hideMark/>
-          </w:tcPr>
-          <w:p>
-            <w:proofErr w:type="spellStart"/>
+          </w:p>
+        </w:tc>
+        <w:tc>
+          <w:tcPr>
+            <w:tcW w:w="0" w:type="auto"/>
+            <w:vAlign w:val="center"/>
+            <w:hideMark/>
+          </w:tcPr>
+          <w:p>
             <w:r>
               <w:t>uuid</w:t>
             </w:r>
-            <w:proofErr w:type="spellEnd"/>
           </w:p>
         </w:tc>
         <w:tc>
@@ -6728,25 +6333,21 @@
             <w:hideMark/>
           </w:tcPr>
           <w:p>
-            <w:proofErr w:type="spellStart"/>
             <w:r>
               <w:t>saldo_total</w:t>
             </w:r>
-            <w:proofErr w:type="spellEnd"/>
-          </w:p>
-        </w:tc>
-        <w:tc>
-          <w:tcPr>
-            <w:tcW w:w="0" w:type="auto"/>
-            <w:vAlign w:val="center"/>
-            <w:hideMark/>
-          </w:tcPr>
-          <w:p>
-            <w:proofErr w:type="spellStart"/>
+          </w:p>
+        </w:tc>
+        <w:tc>
+          <w:tcPr>
+            <w:tcW w:w="0" w:type="auto"/>
+            <w:vAlign w:val="center"/>
+            <w:hideMark/>
+          </w:tcPr>
+          <w:p>
             <w:r>
               <w:t>numeric</w:t>
             </w:r>
-            <w:proofErr w:type="spellEnd"/>
           </w:p>
         </w:tc>
         <w:tc>
@@ -6773,25 +6374,21 @@
             <w:hideMark/>
           </w:tcPr>
           <w:p>
-            <w:proofErr w:type="spellStart"/>
             <w:r>
               <w:t>saldo_disponible</w:t>
             </w:r>
-            <w:proofErr w:type="spellEnd"/>
-          </w:p>
-        </w:tc>
-        <w:tc>
-          <w:tcPr>
-            <w:tcW w:w="0" w:type="auto"/>
-            <w:vAlign w:val="center"/>
-            <w:hideMark/>
-          </w:tcPr>
-          <w:p>
-            <w:proofErr w:type="spellStart"/>
+          </w:p>
+        </w:tc>
+        <w:tc>
+          <w:tcPr>
+            <w:tcW w:w="0" w:type="auto"/>
+            <w:vAlign w:val="center"/>
+            <w:hideMark/>
+          </w:tcPr>
+          <w:p>
             <w:r>
               <w:t>numeric</w:t>
             </w:r>
-            <w:proofErr w:type="spellEnd"/>
           </w:p>
         </w:tc>
         <w:tc>
@@ -6818,25 +6415,21 @@
             <w:hideMark/>
           </w:tcPr>
           <w:p>
-            <w:proofErr w:type="spellStart"/>
             <w:r>
               <w:t>created_at</w:t>
             </w:r>
-            <w:proofErr w:type="spellEnd"/>
-          </w:p>
-        </w:tc>
-        <w:tc>
-          <w:tcPr>
-            <w:tcW w:w="0" w:type="auto"/>
-            <w:vAlign w:val="center"/>
-            <w:hideMark/>
-          </w:tcPr>
-          <w:p>
-            <w:proofErr w:type="spellStart"/>
+          </w:p>
+        </w:tc>
+        <w:tc>
+          <w:tcPr>
+            <w:tcW w:w="0" w:type="auto"/>
+            <w:vAlign w:val="center"/>
+            <w:hideMark/>
+          </w:tcPr>
+          <w:p>
             <w:r>
               <w:t>timestamptz</w:t>
             </w:r>
-            <w:proofErr w:type="spellEnd"/>
           </w:p>
         </w:tc>
         <w:tc>
@@ -6976,11 +6569,9 @@
             <w:hideMark/>
           </w:tcPr>
           <w:p>
-            <w:proofErr w:type="spellStart"/>
             <w:r>
               <w:t>uuid</w:t>
             </w:r>
-            <w:proofErr w:type="spellEnd"/>
           </w:p>
         </w:tc>
         <w:tc>
@@ -7007,25 +6598,21 @@
             <w:hideMark/>
           </w:tcPr>
           <w:p>
-            <w:proofErr w:type="spellStart"/>
             <w:r>
               <w:t>usuario_id</w:t>
             </w:r>
-            <w:proofErr w:type="spellEnd"/>
-          </w:p>
-        </w:tc>
-        <w:tc>
-          <w:tcPr>
-            <w:tcW w:w="0" w:type="auto"/>
-            <w:vAlign w:val="center"/>
-            <w:hideMark/>
-          </w:tcPr>
-          <w:p>
-            <w:proofErr w:type="spellStart"/>
+          </w:p>
+        </w:tc>
+        <w:tc>
+          <w:tcPr>
+            <w:tcW w:w="0" w:type="auto"/>
+            <w:vAlign w:val="center"/>
+            <w:hideMark/>
+          </w:tcPr>
+          <w:p>
             <w:r>
               <w:t>uuid</w:t>
             </w:r>
-            <w:proofErr w:type="spellEnd"/>
           </w:p>
         </w:tc>
         <w:tc>
@@ -7052,25 +6639,21 @@
             <w:hideMark/>
           </w:tcPr>
           <w:p>
-            <w:proofErr w:type="spellStart"/>
             <w:r>
               <w:t>apunte_id</w:t>
             </w:r>
-            <w:proofErr w:type="spellEnd"/>
-          </w:p>
-        </w:tc>
-        <w:tc>
-          <w:tcPr>
-            <w:tcW w:w="0" w:type="auto"/>
-            <w:vAlign w:val="center"/>
-            <w:hideMark/>
-          </w:tcPr>
-          <w:p>
-            <w:proofErr w:type="spellStart"/>
+          </w:p>
+        </w:tc>
+        <w:tc>
+          <w:tcPr>
+            <w:tcW w:w="0" w:type="auto"/>
+            <w:vAlign w:val="center"/>
+            <w:hideMark/>
+          </w:tcPr>
+          <w:p>
             <w:r>
               <w:t>uuid</w:t>
             </w:r>
-            <w:proofErr w:type="spellEnd"/>
           </w:p>
         </w:tc>
         <w:tc>
@@ -7109,30 +6692,20 @@
             <w:hideMark/>
           </w:tcPr>
           <w:p>
-            <w:proofErr w:type="spellStart"/>
             <w:r>
               <w:t>text</w:t>
             </w:r>
-            <w:proofErr w:type="spellEnd"/>
-          </w:p>
-        </w:tc>
-        <w:tc>
-          <w:tcPr>
-            <w:tcW w:w="0" w:type="auto"/>
-            <w:vAlign w:val="center"/>
-            <w:hideMark/>
-          </w:tcPr>
-          <w:p>
-            <w:r>
-              <w:t>'propina', '</w:t>
-            </w:r>
-            <w:proofErr w:type="spellStart"/>
-            <w:r>
-              <w:t>descarga_bonus</w:t>
-            </w:r>
-            <w:proofErr w:type="spellEnd"/>
-            <w:r>
-              <w:t>', 'retiro'</w:t>
+          </w:p>
+        </w:tc>
+        <w:tc>
+          <w:tcPr>
+            <w:tcW w:w="0" w:type="auto"/>
+            <w:vAlign w:val="center"/>
+            <w:hideMark/>
+          </w:tcPr>
+          <w:p>
+            <w:r>
+              <w:t>'propina', 'descarga_bonus', 'retiro'</w:t>
             </w:r>
           </w:p>
         </w:tc>
@@ -7160,11 +6733,9 @@
             <w:hideMark/>
           </w:tcPr>
           <w:p>
-            <w:proofErr w:type="spellStart"/>
             <w:r>
               <w:t>numeric</w:t>
             </w:r>
-            <w:proofErr w:type="spellEnd"/>
           </w:p>
         </w:tc>
         <w:tc>
@@ -7191,25 +6762,21 @@
             <w:hideMark/>
           </w:tcPr>
           <w:p>
-            <w:proofErr w:type="spellStart"/>
             <w:r>
               <w:t>descripcion</w:t>
             </w:r>
-            <w:proofErr w:type="spellEnd"/>
-          </w:p>
-        </w:tc>
-        <w:tc>
-          <w:tcPr>
-            <w:tcW w:w="0" w:type="auto"/>
-            <w:vAlign w:val="center"/>
-            <w:hideMark/>
-          </w:tcPr>
-          <w:p>
-            <w:proofErr w:type="spellStart"/>
+          </w:p>
+        </w:tc>
+        <w:tc>
+          <w:tcPr>
+            <w:tcW w:w="0" w:type="auto"/>
+            <w:vAlign w:val="center"/>
+            <w:hideMark/>
+          </w:tcPr>
+          <w:p>
             <w:r>
               <w:t>text</w:t>
             </w:r>
-            <w:proofErr w:type="spellEnd"/>
           </w:p>
         </w:tc>
         <w:tc>
@@ -7236,25 +6803,21 @@
             <w:hideMark/>
           </w:tcPr>
           <w:p>
-            <w:proofErr w:type="spellStart"/>
             <w:r>
               <w:t>created_at</w:t>
             </w:r>
-            <w:proofErr w:type="spellEnd"/>
-          </w:p>
-        </w:tc>
-        <w:tc>
-          <w:tcPr>
-            <w:tcW w:w="0" w:type="auto"/>
-            <w:vAlign w:val="center"/>
-            <w:hideMark/>
-          </w:tcPr>
-          <w:p>
-            <w:proofErr w:type="spellStart"/>
+          </w:p>
+        </w:tc>
+        <w:tc>
+          <w:tcPr>
+            <w:tcW w:w="0" w:type="auto"/>
+            <w:vAlign w:val="center"/>
+            <w:hideMark/>
+          </w:tcPr>
+          <w:p>
             <w:r>
               <w:t>timestamptz</w:t>
             </w:r>
-            <w:proofErr w:type="spellEnd"/>
           </w:p>
         </w:tc>
         <w:tc>
@@ -7327,15 +6890,7 @@
         <w:t>Google OAuth 2.0</w:t>
       </w:r>
       <w:r>
-        <w:t xml:space="preserve"> a través de </w:t>
-      </w:r>
-      <w:proofErr w:type="spellStart"/>
-      <w:r>
-        <w:t>Supabase</w:t>
-      </w:r>
-      <w:proofErr w:type="spellEnd"/>
-      <w:r>
-        <w:t xml:space="preserve"> Auth</w:t>
+        <w:t xml:space="preserve"> a través de Supabase Auth</w:t>
       </w:r>
     </w:p>
     <w:p>
@@ -7346,13 +6901,8 @@
         </w:numPr>
       </w:pPr>
       <w:r>
-        <w:t xml:space="preserve">Tokens JWT gestionados automáticamente por </w:t>
-      </w:r>
-      <w:proofErr w:type="spellStart"/>
-      <w:r>
-        <w:t>Supabase</w:t>
-      </w:r>
-      <w:proofErr w:type="spellEnd"/>
+        <w:t>Tokens JWT gestionados automáticamente por Supabase</w:t>
+      </w:r>
     </w:p>
     <w:p>
       <w:pPr>
@@ -7362,15 +6912,7 @@
         </w:numPr>
       </w:pPr>
       <w:r>
-        <w:t xml:space="preserve">Redirección automática a </w:t>
-      </w:r>
-      <w:proofErr w:type="spellStart"/>
-      <w:r>
-        <w:t>login</w:t>
-      </w:r>
-      <w:proofErr w:type="spellEnd"/>
-      <w:r>
-        <w:t xml:space="preserve"> en páginas protegidas si no hay sesión activa</w:t>
+        <w:t>Redirección automática a login en páginas protegidas si no hay sesión activa</w:t>
       </w:r>
     </w:p>
     <w:p>
@@ -7444,23 +6986,7 @@
         </w:numPr>
       </w:pPr>
       <w:r>
-        <w:t xml:space="preserve">Los archivos PDF se almacenan en </w:t>
-      </w:r>
-      <w:proofErr w:type="spellStart"/>
-      <w:r>
-        <w:t>Supabase</w:t>
-      </w:r>
-      <w:proofErr w:type="spellEnd"/>
-      <w:r>
-        <w:t xml:space="preserve"> Storage con </w:t>
-      </w:r>
-      <w:proofErr w:type="spellStart"/>
-      <w:r>
-        <w:t>URLs</w:t>
-      </w:r>
-      <w:proofErr w:type="spellEnd"/>
-      <w:r>
-        <w:t xml:space="preserve"> públicas no predecibles (UUID en el nombre)</w:t>
+        <w:t>Los archivos PDF se almacenan en Supabase Storage con URLs públicas no predecibles (UUID en el nombre)</w:t>
       </w:r>
     </w:p>
     <w:p>
@@ -7482,15 +7008,7 @@
         </w:numPr>
       </w:pPr>
       <w:r>
-        <w:t xml:space="preserve">Los datos personales (email, avatar) provienen directamente de Google y no se almacenan en texto plano fuera de </w:t>
-      </w:r>
-      <w:proofErr w:type="spellStart"/>
-      <w:r>
-        <w:t>Supabase</w:t>
-      </w:r>
-      <w:proofErr w:type="spellEnd"/>
-      <w:r>
-        <w:t xml:space="preserve"> Auth</w:t>
+        <w:t>Los datos personales (email, avatar) provienen directamente de Google y no se almacenan en texto plano fuera de Supabase Auth</w:t>
       </w:r>
     </w:p>
     <w:p>
@@ -7516,17 +7034,8 @@
           <w:b/>
           <w:bCs/>
         </w:rPr>
-        <w:t xml:space="preserve">4.4 Validaciones </w:t>
-      </w:r>
-      <w:proofErr w:type="spellStart"/>
-      <w:r>
-        <w:rPr>
-          <w:b/>
-          <w:bCs/>
-        </w:rPr>
-        <w:t>Frontend</w:t>
-      </w:r>
-      <w:proofErr w:type="spellEnd"/>
+        <w:t>4.4 Validaciones Frontend</w:t>
+      </w:r>
     </w:p>
     <w:p>
       <w:pPr>
@@ -7570,23 +7079,7 @@
       </w:pPr>
       <w:r>
         <w:lastRenderedPageBreak/>
-        <w:t xml:space="preserve">Sanitización implícita mediante uso de </w:t>
-      </w:r>
-      <w:proofErr w:type="spellStart"/>
-      <w:r>
-        <w:t>textContent</w:t>
-      </w:r>
-      <w:proofErr w:type="spellEnd"/>
-      <w:r>
-        <w:t xml:space="preserve"> en lugar de </w:t>
-      </w:r>
-      <w:proofErr w:type="spellStart"/>
-      <w:r>
-        <w:t>innerHTML</w:t>
-      </w:r>
-      <w:proofErr w:type="spellEnd"/>
-      <w:r>
-        <w:t xml:space="preserve"> para datos del usuario</w:t>
+        <w:t>Sanitización implícita mediante uso de textContent en lugar de innerHTML para datos del usuario</w:t>
       </w:r>
     </w:p>
     <w:p>
@@ -7612,31 +7105,7 @@
         </w:numPr>
       </w:pPr>
       <w:r>
-        <w:t xml:space="preserve">La </w:t>
-      </w:r>
-      <w:proofErr w:type="spellStart"/>
-      <w:r>
-        <w:t>anon</w:t>
-      </w:r>
-      <w:proofErr w:type="spellEnd"/>
-      <w:r>
-        <w:t xml:space="preserve"> </w:t>
-      </w:r>
-      <w:proofErr w:type="spellStart"/>
-      <w:r>
-        <w:t>key</w:t>
-      </w:r>
-      <w:proofErr w:type="spellEnd"/>
-      <w:r>
-        <w:t xml:space="preserve"> de </w:t>
-      </w:r>
-      <w:proofErr w:type="spellStart"/>
-      <w:r>
-        <w:t>Supabase</w:t>
-      </w:r>
-      <w:proofErr w:type="spellEnd"/>
-      <w:r>
-        <w:t xml:space="preserve"> es pública por diseño — solo permite operaciones que las políticas RLS permiten</w:t>
+        <w:t>La anon key de Supabase es pública por diseño — solo permite operaciones que las políticas RLS permiten</w:t>
       </w:r>
     </w:p>
     <w:p>
@@ -7647,21 +7116,8 @@
         </w:numPr>
       </w:pPr>
       <w:r>
-        <w:t>No se exponen claves privadas (</w:t>
-      </w:r>
-      <w:proofErr w:type="spellStart"/>
-      <w:r>
-        <w:t>service_role</w:t>
-      </w:r>
-      <w:proofErr w:type="spellEnd"/>
-      <w:r>
-        <w:t xml:space="preserve">) en el </w:t>
-      </w:r>
-      <w:proofErr w:type="spellStart"/>
-      <w:r>
-        <w:t>frontend</w:t>
-      </w:r>
-      <w:proofErr w:type="spellEnd"/>
+        <w:t>No se exponen claves privadas (service_role) en el frontend</w:t>
+      </w:r>
     </w:p>
     <w:p/>
     <w:p/>
@@ -9179,6 +8635,7 @@
   <w:style w:type="character" w:default="1" w:styleId="Fuentedeprrafopredeter">
     <w:name w:val="Default Paragraph Font"/>
     <w:uiPriority w:val="1"/>
+    <w:semiHidden/>
     <w:unhideWhenUsed/>
   </w:style>
   <w:style w:type="table" w:default="1" w:styleId="Tablanormal">

</xml_diff>